<commit_message>
Leaders meeting: add document links to the agenda and the Word handout
Co-Authored-By: Claude Sonnet 5.5 <noreply@anthropic.com>
</commit_message>
<xml_diff>
--- a/docs/platform-management/Leaders-Meeting-Handout.docx
+++ b/docs/platform-management/Leaders-Meeting-Handout.docx
@@ -1,6 +1,6 @@
 
 <file path=word/document.xml><?xml version="1.0" encoding="utf-8"?>
-<w:document xmlns:w="http://schemas.openxmlformats.org/wordprocessingml/2006/main">
+<w:document xmlns:w="http://schemas.openxmlformats.org/wordprocessingml/2006/main" xmlns:r="http://schemas.openxmlformats.org/officeDocument/2006/relationships">
   <w:body>
     <w:p>
       <w:pPr>
@@ -570,6 +570,289 @@
         </w:rPr>
         <w:t xml:space="preserve">• What must be ready before enrolling children? Who mentors a new organization in its first month?</w:t>
       </w:r>
+    </w:p>
+    <w:p>
+      <w:pPr>
+        <w:spacing w:before="120" w:after="40"/>
+      </w:pPr>
+      <w:r>
+        <w:rPr>
+          <w:b/>
+          <w:color w:val="1F6F6B"/>
+          <w:sz w:val="24"/>
+        </w:rPr>
+        <w:t xml:space="preserve">Documents (all in the public repository, folder docs/)</w:t>
+      </w:r>
+    </w:p>
+    <w:p>
+      <w:pPr>
+        <w:spacing w:before="0" w:after="40"/>
+      </w:pPr>
+      <w:r>
+        <w:rPr>
+          <w:b/>
+          <w:sz w:val="19"/>
+        </w:rPr>
+        <w:t xml:space="preserve">Child safety: </w:t>
+      </w:r>
+      <w:hyperlink r:id="rId2">
+        <w:r>
+          <w:rPr>
+            <w:color w:val="0563C1"/>
+            <w:u w:val="single"/>
+            <w:sz w:val="19"/>
+          </w:rPr>
+          <w:t xml:space="preserve">Leader guide</w:t>
+        </w:r>
+      </w:hyperlink>
+      <w:r>
+        <w:rPr>
+          <w:sz w:val="19"/>
+        </w:rPr>
+        <w:t xml:space="preserve">  ·  </w:t>
+      </w:r>
+      <w:hyperlink r:id="rId3">
+        <w:r>
+          <w:rPr>
+            <w:color w:val="0563C1"/>
+            <w:u w:val="single"/>
+            <w:sz w:val="19"/>
+          </w:rPr>
+          <w:t xml:space="preserve">Safeguarding policy</w:t>
+        </w:r>
+      </w:hyperlink>
+      <w:r>
+        <w:rPr>
+          <w:sz w:val="19"/>
+        </w:rPr>
+        <w:t xml:space="preserve">  ·  </w:t>
+      </w:r>
+      <w:hyperlink r:id="rId4">
+        <w:r>
+          <w:rPr>
+            <w:color w:val="0563C1"/>
+            <w:u w:val="single"/>
+            <w:sz w:val="19"/>
+          </w:rPr>
+          <w:t xml:space="preserve">AI safety</w:t>
+        </w:r>
+      </w:hyperlink>
+      <w:r>
+        <w:rPr>
+          <w:sz w:val="19"/>
+        </w:rPr>
+        <w:t xml:space="preserve">  ·  </w:t>
+      </w:r>
+      <w:hyperlink r:id="rId5">
+        <w:r>
+          <w:rPr>
+            <w:color w:val="0563C1"/>
+            <w:u w:val="single"/>
+            <w:sz w:val="19"/>
+          </w:rPr>
+          <w:t xml:space="preserve">Leader training</w:t>
+        </w:r>
+      </w:hyperlink>
+      <w:r>
+        <w:rPr>
+          <w:sz w:val="19"/>
+        </w:rPr>
+        <w:t xml:space="preserve">  ·  </w:t>
+      </w:r>
+      <w:hyperlink r:id="rId6">
+        <w:r>
+          <w:rPr>
+            <w:color w:val="0563C1"/>
+            <w:u w:val="single"/>
+            <w:sz w:val="19"/>
+          </w:rPr>
+          <w:t xml:space="preserve">Code of conduct</w:t>
+        </w:r>
+      </w:hyperlink>
+    </w:p>
+    <w:p>
+      <w:pPr>
+        <w:spacing w:before="0" w:after="40"/>
+      </w:pPr>
+      <w:r>
+        <w:rPr>
+          <w:b/>
+          <w:sz w:val="19"/>
+        </w:rPr>
+        <w:t xml:space="preserve">Forms: </w:t>
+      </w:r>
+      <w:hyperlink r:id="rId7">
+        <w:r>
+          <w:rPr>
+            <w:color w:val="0563C1"/>
+            <w:u w:val="single"/>
+            <w:sz w:val="19"/>
+          </w:rPr>
+          <w:t xml:space="preserve">Forms index</w:t>
+        </w:r>
+      </w:hyperlink>
+      <w:r>
+        <w:rPr>
+          <w:sz w:val="19"/>
+        </w:rPr>
+        <w:t xml:space="preserve">  ·  </w:t>
+      </w:r>
+      <w:hyperlink r:id="rId8">
+        <w:r>
+          <w:rPr>
+            <w:color w:val="0563C1"/>
+            <w:u w:val="single"/>
+            <w:sz w:val="19"/>
+          </w:rPr>
+          <w:t xml:space="preserve">Parent consent (Word)</w:t>
+        </w:r>
+      </w:hyperlink>
+      <w:r>
+        <w:rPr>
+          <w:sz w:val="19"/>
+        </w:rPr>
+        <w:t xml:space="preserve">  ·  </w:t>
+      </w:r>
+      <w:hyperlink r:id="rId9">
+        <w:r>
+          <w:rPr>
+            <w:color w:val="0563C1"/>
+            <w:u w:val="single"/>
+            <w:sz w:val="19"/>
+          </w:rPr>
+          <w:t xml:space="preserve">Consent add-on (Word)</w:t>
+        </w:r>
+      </w:hyperlink>
+    </w:p>
+    <w:p>
+      <w:pPr>
+        <w:spacing w:before="0" w:after="40"/>
+      </w:pPr>
+      <w:r>
+        <w:rPr>
+          <w:b/>
+          <w:sz w:val="19"/>
+        </w:rPr>
+        <w:t xml:space="preserve">Privacy: </w:t>
+      </w:r>
+      <w:hyperlink r:id="rId10">
+        <w:r>
+          <w:rPr>
+            <w:color w:val="0563C1"/>
+            <w:u w:val="single"/>
+            <w:sz w:val="19"/>
+          </w:rPr>
+          <w:t xml:space="preserve">Learner privacy</w:t>
+        </w:r>
+      </w:hyperlink>
+      <w:r>
+        <w:rPr>
+          <w:sz w:val="19"/>
+        </w:rPr>
+        <w:t xml:space="preserve">  ·  </w:t>
+      </w:r>
+      <w:hyperlink r:id="rId11">
+        <w:r>
+          <w:rPr>
+            <w:color w:val="0563C1"/>
+            <w:u w:val="single"/>
+            <w:sz w:val="19"/>
+          </w:rPr>
+          <w:t xml:space="preserve">Data handling commitment</w:t>
+        </w:r>
+      </w:hyperlink>
+    </w:p>
+    <w:p>
+      <w:pPr>
+        <w:spacing w:before="0" w:after="40"/>
+      </w:pPr>
+      <w:r>
+        <w:rPr>
+          <w:b/>
+          <w:sz w:val="19"/>
+        </w:rPr>
+        <w:t xml:space="preserve">Change process: </w:t>
+      </w:r>
+      <w:hyperlink r:id="rId12">
+        <w:r>
+          <w:rPr>
+            <w:color w:val="0563C1"/>
+            <w:u w:val="single"/>
+            <w:sz w:val="19"/>
+          </w:rPr>
+          <w:t xml:space="preserve">Change process</w:t>
+        </w:r>
+      </w:hyperlink>
+      <w:r>
+        <w:rPr>
+          <w:sz w:val="19"/>
+        </w:rPr>
+        <w:t xml:space="preserve">  ·  </w:t>
+      </w:r>
+      <w:hyperlink r:id="rId13">
+        <w:r>
+          <w:rPr>
+            <w:color w:val="0563C1"/>
+            <w:u w:val="single"/>
+            <w:sz w:val="19"/>
+          </w:rPr>
+          <w:t xml:space="preserve">Decision log</w:t>
+        </w:r>
+      </w:hyperlink>
+      <w:r>
+        <w:rPr>
+          <w:sz w:val="19"/>
+        </w:rPr>
+        <w:t xml:space="preserve">  ·  </w:t>
+      </w:r>
+      <w:hyperlink r:id="rId14">
+        <w:r>
+          <w:rPr>
+            <w:color w:val="0563C1"/>
+            <w:u w:val="single"/>
+            <w:sz w:val="19"/>
+          </w:rPr>
+          <w:t xml:space="preserve">Security program</w:t>
+        </w:r>
+      </w:hyperlink>
+    </w:p>
+    <w:p>
+      <w:pPr>
+        <w:spacing w:before="0" w:after="40"/>
+      </w:pPr>
+      <w:r>
+        <w:rPr>
+          <w:b/>
+          <w:sz w:val="19"/>
+        </w:rPr>
+        <w:t xml:space="preserve">Onboarding: </w:t>
+      </w:r>
+      <w:hyperlink r:id="rId15">
+        <w:r>
+          <w:rPr>
+            <w:color w:val="0563C1"/>
+            <w:u w:val="single"/>
+            <w:sz w:val="19"/>
+          </w:rPr>
+          <w:t xml:space="preserve">Onboarding guide</w:t>
+        </w:r>
+      </w:hyperlink>
+      <w:r>
+        <w:rPr>
+          <w:sz w:val="19"/>
+        </w:rPr>
+        <w:t xml:space="preserve">  ·  </w:t>
+      </w:r>
+      <w:hyperlink r:id="rId16">
+        <w:r>
+          <w:rPr>
+            <w:color w:val="0563C1"/>
+            <w:u w:val="single"/>
+            <w:sz w:val="19"/>
+          </w:rPr>
+          <w:t xml:space="preserve">Partnership agreement (Word)</w:t>
+        </w:r>
+      </w:hyperlink>
     </w:p>
     <w:p>
       <w:pPr>

</xml_diff>

<commit_message>
Leaders meeting: add document links to the agenda and the Word handout (#342)
Co-authored-by: Claude Sonnet 5.5 <noreply@anthropic.com>
</commit_message>
<xml_diff>
--- a/docs/platform-management/Leaders-Meeting-Handout.docx
+++ b/docs/platform-management/Leaders-Meeting-Handout.docx
@@ -1,6 +1,6 @@
 
 <file path=word/document.xml><?xml version="1.0" encoding="utf-8"?>
-<w:document xmlns:w="http://schemas.openxmlformats.org/wordprocessingml/2006/main">
+<w:document xmlns:w="http://schemas.openxmlformats.org/wordprocessingml/2006/main" xmlns:r="http://schemas.openxmlformats.org/officeDocument/2006/relationships">
   <w:body>
     <w:p>
       <w:pPr>
@@ -570,6 +570,289 @@
         </w:rPr>
         <w:t xml:space="preserve">• What must be ready before enrolling children? Who mentors a new organization in its first month?</w:t>
       </w:r>
+    </w:p>
+    <w:p>
+      <w:pPr>
+        <w:spacing w:before="120" w:after="40"/>
+      </w:pPr>
+      <w:r>
+        <w:rPr>
+          <w:b/>
+          <w:color w:val="1F6F6B"/>
+          <w:sz w:val="24"/>
+        </w:rPr>
+        <w:t xml:space="preserve">Documents (all in the public repository, folder docs/)</w:t>
+      </w:r>
+    </w:p>
+    <w:p>
+      <w:pPr>
+        <w:spacing w:before="0" w:after="40"/>
+      </w:pPr>
+      <w:r>
+        <w:rPr>
+          <w:b/>
+          <w:sz w:val="19"/>
+        </w:rPr>
+        <w:t xml:space="preserve">Child safety: </w:t>
+      </w:r>
+      <w:hyperlink r:id="rId2">
+        <w:r>
+          <w:rPr>
+            <w:color w:val="0563C1"/>
+            <w:u w:val="single"/>
+            <w:sz w:val="19"/>
+          </w:rPr>
+          <w:t xml:space="preserve">Leader guide</w:t>
+        </w:r>
+      </w:hyperlink>
+      <w:r>
+        <w:rPr>
+          <w:sz w:val="19"/>
+        </w:rPr>
+        <w:t xml:space="preserve">  ·  </w:t>
+      </w:r>
+      <w:hyperlink r:id="rId3">
+        <w:r>
+          <w:rPr>
+            <w:color w:val="0563C1"/>
+            <w:u w:val="single"/>
+            <w:sz w:val="19"/>
+          </w:rPr>
+          <w:t xml:space="preserve">Safeguarding policy</w:t>
+        </w:r>
+      </w:hyperlink>
+      <w:r>
+        <w:rPr>
+          <w:sz w:val="19"/>
+        </w:rPr>
+        <w:t xml:space="preserve">  ·  </w:t>
+      </w:r>
+      <w:hyperlink r:id="rId4">
+        <w:r>
+          <w:rPr>
+            <w:color w:val="0563C1"/>
+            <w:u w:val="single"/>
+            <w:sz w:val="19"/>
+          </w:rPr>
+          <w:t xml:space="preserve">AI safety</w:t>
+        </w:r>
+      </w:hyperlink>
+      <w:r>
+        <w:rPr>
+          <w:sz w:val="19"/>
+        </w:rPr>
+        <w:t xml:space="preserve">  ·  </w:t>
+      </w:r>
+      <w:hyperlink r:id="rId5">
+        <w:r>
+          <w:rPr>
+            <w:color w:val="0563C1"/>
+            <w:u w:val="single"/>
+            <w:sz w:val="19"/>
+          </w:rPr>
+          <w:t xml:space="preserve">Leader training</w:t>
+        </w:r>
+      </w:hyperlink>
+      <w:r>
+        <w:rPr>
+          <w:sz w:val="19"/>
+        </w:rPr>
+        <w:t xml:space="preserve">  ·  </w:t>
+      </w:r>
+      <w:hyperlink r:id="rId6">
+        <w:r>
+          <w:rPr>
+            <w:color w:val="0563C1"/>
+            <w:u w:val="single"/>
+            <w:sz w:val="19"/>
+          </w:rPr>
+          <w:t xml:space="preserve">Code of conduct</w:t>
+        </w:r>
+      </w:hyperlink>
+    </w:p>
+    <w:p>
+      <w:pPr>
+        <w:spacing w:before="0" w:after="40"/>
+      </w:pPr>
+      <w:r>
+        <w:rPr>
+          <w:b/>
+          <w:sz w:val="19"/>
+        </w:rPr>
+        <w:t xml:space="preserve">Forms: </w:t>
+      </w:r>
+      <w:hyperlink r:id="rId7">
+        <w:r>
+          <w:rPr>
+            <w:color w:val="0563C1"/>
+            <w:u w:val="single"/>
+            <w:sz w:val="19"/>
+          </w:rPr>
+          <w:t xml:space="preserve">Forms index</w:t>
+        </w:r>
+      </w:hyperlink>
+      <w:r>
+        <w:rPr>
+          <w:sz w:val="19"/>
+        </w:rPr>
+        <w:t xml:space="preserve">  ·  </w:t>
+      </w:r>
+      <w:hyperlink r:id="rId8">
+        <w:r>
+          <w:rPr>
+            <w:color w:val="0563C1"/>
+            <w:u w:val="single"/>
+            <w:sz w:val="19"/>
+          </w:rPr>
+          <w:t xml:space="preserve">Parent consent (Word)</w:t>
+        </w:r>
+      </w:hyperlink>
+      <w:r>
+        <w:rPr>
+          <w:sz w:val="19"/>
+        </w:rPr>
+        <w:t xml:space="preserve">  ·  </w:t>
+      </w:r>
+      <w:hyperlink r:id="rId9">
+        <w:r>
+          <w:rPr>
+            <w:color w:val="0563C1"/>
+            <w:u w:val="single"/>
+            <w:sz w:val="19"/>
+          </w:rPr>
+          <w:t xml:space="preserve">Consent add-on (Word)</w:t>
+        </w:r>
+      </w:hyperlink>
+    </w:p>
+    <w:p>
+      <w:pPr>
+        <w:spacing w:before="0" w:after="40"/>
+      </w:pPr>
+      <w:r>
+        <w:rPr>
+          <w:b/>
+          <w:sz w:val="19"/>
+        </w:rPr>
+        <w:t xml:space="preserve">Privacy: </w:t>
+      </w:r>
+      <w:hyperlink r:id="rId10">
+        <w:r>
+          <w:rPr>
+            <w:color w:val="0563C1"/>
+            <w:u w:val="single"/>
+            <w:sz w:val="19"/>
+          </w:rPr>
+          <w:t xml:space="preserve">Learner privacy</w:t>
+        </w:r>
+      </w:hyperlink>
+      <w:r>
+        <w:rPr>
+          <w:sz w:val="19"/>
+        </w:rPr>
+        <w:t xml:space="preserve">  ·  </w:t>
+      </w:r>
+      <w:hyperlink r:id="rId11">
+        <w:r>
+          <w:rPr>
+            <w:color w:val="0563C1"/>
+            <w:u w:val="single"/>
+            <w:sz w:val="19"/>
+          </w:rPr>
+          <w:t xml:space="preserve">Data handling commitment</w:t>
+        </w:r>
+      </w:hyperlink>
+    </w:p>
+    <w:p>
+      <w:pPr>
+        <w:spacing w:before="0" w:after="40"/>
+      </w:pPr>
+      <w:r>
+        <w:rPr>
+          <w:b/>
+          <w:sz w:val="19"/>
+        </w:rPr>
+        <w:t xml:space="preserve">Change process: </w:t>
+      </w:r>
+      <w:hyperlink r:id="rId12">
+        <w:r>
+          <w:rPr>
+            <w:color w:val="0563C1"/>
+            <w:u w:val="single"/>
+            <w:sz w:val="19"/>
+          </w:rPr>
+          <w:t xml:space="preserve">Change process</w:t>
+        </w:r>
+      </w:hyperlink>
+      <w:r>
+        <w:rPr>
+          <w:sz w:val="19"/>
+        </w:rPr>
+        <w:t xml:space="preserve">  ·  </w:t>
+      </w:r>
+      <w:hyperlink r:id="rId13">
+        <w:r>
+          <w:rPr>
+            <w:color w:val="0563C1"/>
+            <w:u w:val="single"/>
+            <w:sz w:val="19"/>
+          </w:rPr>
+          <w:t xml:space="preserve">Decision log</w:t>
+        </w:r>
+      </w:hyperlink>
+      <w:r>
+        <w:rPr>
+          <w:sz w:val="19"/>
+        </w:rPr>
+        <w:t xml:space="preserve">  ·  </w:t>
+      </w:r>
+      <w:hyperlink r:id="rId14">
+        <w:r>
+          <w:rPr>
+            <w:color w:val="0563C1"/>
+            <w:u w:val="single"/>
+            <w:sz w:val="19"/>
+          </w:rPr>
+          <w:t xml:space="preserve">Security program</w:t>
+        </w:r>
+      </w:hyperlink>
+    </w:p>
+    <w:p>
+      <w:pPr>
+        <w:spacing w:before="0" w:after="40"/>
+      </w:pPr>
+      <w:r>
+        <w:rPr>
+          <w:b/>
+          <w:sz w:val="19"/>
+        </w:rPr>
+        <w:t xml:space="preserve">Onboarding: </w:t>
+      </w:r>
+      <w:hyperlink r:id="rId15">
+        <w:r>
+          <w:rPr>
+            <w:color w:val="0563C1"/>
+            <w:u w:val="single"/>
+            <w:sz w:val="19"/>
+          </w:rPr>
+          <w:t xml:space="preserve">Onboarding guide</w:t>
+        </w:r>
+      </w:hyperlink>
+      <w:r>
+        <w:rPr>
+          <w:sz w:val="19"/>
+        </w:rPr>
+        <w:t xml:space="preserve">  ·  </w:t>
+      </w:r>
+      <w:hyperlink r:id="rId16">
+        <w:r>
+          <w:rPr>
+            <w:color w:val="0563C1"/>
+            <w:u w:val="single"/>
+            <w:sz w:val="19"/>
+          </w:rPr>
+          <w:t xml:space="preserve">Partnership agreement (Word)</w:t>
+        </w:r>
+      </w:hyperlink>
     </w:p>
     <w:p>
       <w:pPr>

</xml_diff>

<commit_message>
Leaders meeting: add the continuity plan item to the agenda and handout
Co-Authored-By: Claude Sonnet 5.5 <noreply@anthropic.com>
</commit_message>
<xml_diff>
--- a/docs/platform-management/Leaders-Meeting-Handout.docx
+++ b/docs/platform-management/Leaders-Meeting-Handout.docx
@@ -12,7 +12,7 @@
           <w:color w:val="1F2A37"/>
           <w:sz w:val="34"/>
         </w:rPr>
-        <w:t xml:space="preserve">Leaders meeting: child safety, roles, change process, onboarding</w:t>
+        <w:t xml:space="preserve">Leaders meeting: child safety, roles, change process, onboarding, continuity</w:t>
       </w:r>
     </w:p>
     <w:p>
@@ -24,7 +24,7 @@
           <w:color w:val="4F5B69"/>
           <w:sz w:val="22"/>
         </w:rPr>
-        <w:t xml:space="preserve">Thursday 22 October 2026 · about 90 minutes · Organizer: Kevin Hallinan</w:t>
+        <w:t xml:space="preserve">Thursday 22 October 2026 · about 105 minutes · Organizer: Kevin Hallinan</w:t>
       </w:r>
     </w:p>
     <w:p>
@@ -384,6 +384,57 @@
               <w:rPr>
                 <w:sz w:val="21"/>
               </w:rPr>
+              <w:t xml:space="preserve">15 min</w:t>
+            </w:r>
+          </w:p>
+        </w:tc>
+        <w:tc>
+          <w:tcPr>
+            <w:tcW w:w="3900" w:type="dxa"/>
+          </w:tcPr>
+          <w:p>
+            <w:pPr>
+              <w:spacing w:before="0" w:after="0"/>
+            </w:pPr>
+            <w:r>
+              <w:rPr>
+                <w:b/>
+                <w:sz w:val="21"/>
+              </w:rPr>
+              <w:t xml:space="preserve">5. Continuity plan</w:t>
+            </w:r>
+          </w:p>
+        </w:tc>
+        <w:tc>
+          <w:tcPr>
+            <w:tcW w:w="5400" w:type="dxa"/>
+          </w:tcPr>
+          <w:p>
+            <w:pPr>
+              <w:spacing w:before="0" w:after="0"/>
+            </w:pPr>
+            <w:r>
+              <w:rPr>
+                <w:sz w:val="21"/>
+              </w:rPr>
+              <w:t xml:space="preserve">Backups for every role; the Oloibiri worksheet</w:t>
+            </w:r>
+          </w:p>
+        </w:tc>
+      </w:tr>
+      <w:tr>
+        <w:tc>
+          <w:tcPr>
+            <w:tcW w:w="1100" w:type="dxa"/>
+          </w:tcPr>
+          <w:p>
+            <w:pPr>
+              <w:spacing w:before="0" w:after="0"/>
+            </w:pPr>
+            <w:r>
+              <w:rPr>
+                <w:sz w:val="21"/>
+              </w:rPr>
               <w:t xml:space="preserve">5 min</w:t>
             </w:r>
           </w:p>
@@ -569,6 +620,43 @@
           <w:sz w:val="21"/>
         </w:rPr>
         <w:t xml:space="preserve">• What must be ready before enrolling children? Who mentors a new organization in its first month?</w:t>
+      </w:r>
+    </w:p>
+    <w:p>
+      <w:pPr>
+        <w:spacing w:before="120" w:after="40"/>
+      </w:pPr>
+      <w:r>
+        <w:rPr>
+          <w:b/>
+          <w:color w:val="1F6F6B"/>
+          <w:sz w:val="24"/>
+        </w:rPr>
+        <w:t xml:space="preserve">5. Continuity plan (15 min)</w:t>
+      </w:r>
+    </w:p>
+    <w:p>
+      <w:pPr>
+        <w:spacing w:before="0" w:after="30"/>
+        <w:ind w:left="284" w:hanging="200"/>
+      </w:pPr>
+      <w:r>
+        <w:rPr>
+          <w:sz w:val="21"/>
+        </w:rPr>
+        <w:t xml:space="preserve">• The programme keeps running and children stay safe when any one person is missing. Does every critical role have a named backup?</w:t>
+      </w:r>
+    </w:p>
+    <w:p>
+      <w:pPr>
+        <w:spacing w:before="0" w:after="30"/>
+        <w:ind w:left="284" w:hanging="200"/>
+      </w:pPr>
+      <w:r>
+        <w:rPr>
+          <w:sz w:val="21"/>
+        </w:rPr>
+        <w:t xml:space="preserve">• Who reaches the lab, internet account, signed forms and the platform team if the main person is away? Next: a 90-minute working session with Divinegift, Confidence and Bennywhite.</w:t>
       </w:r>
     </w:p>
     <w:p>

</xml_diff>

<commit_message>
Leaders meeting: update continuity plan roles (Platform Administrator Assistant, CTO succession, Grants and Partnership Leadership, platform ownership)
Co-Authored-By: Claude Sonnet 5.5 <noreply@anthropic.com>
</commit_message>
<xml_diff>
--- a/docs/platform-management/Leaders-Meeting-Handout.docx
+++ b/docs/platform-management/Leaders-Meeting-Handout.docx
@@ -645,6 +645,18 @@
           <w:sz w:val="21"/>
         </w:rPr>
         <w:t xml:space="preserve">• The programme keeps running and children stay safe when any one person is missing. Does every critical role have a named backup?</w:t>
+      </w:r>
+    </w:p>
+    <w:p>
+      <w:pPr>
+        <w:spacing w:before="0" w:after="30"/>
+        <w:ind w:left="284" w:hanging="200"/>
+      </w:pPr>
+      <w:r>
+        <w:rPr>
+          <w:sz w:val="21"/>
+        </w:rPr>
+        <w:t xml:space="preserve">• Key people: Kevin Hallinan is CTO and leads Grants and Partnerships, and Randy Hinders will take over as CTO in time. Silas Clergy is the Platform Administrator Assistant and receives the safety and triage emails. nextVillage and vAI own the platform.</w:t>
       </w:r>
     </w:p>
     <w:p>

</xml_diff>

<commit_message>
Leaders meeting: continuity plan in agenda and handout, with corrected roles (#343)
* Leaders meeting: add the continuity plan item to the agenda and handout

Co-Authored-By: Claude Sonnet 5.5 <noreply@anthropic.com>

* Leaders meeting: update continuity plan roles (Platform Administrator Assistant, CTO succession, Grants and Partnership Leadership, platform ownership)

Co-Authored-By: Claude Sonnet 5.5 <noreply@anthropic.com>

---------

Co-authored-by: Claude Sonnet 5.5 <noreply@anthropic.com>
</commit_message>
<xml_diff>
--- a/docs/platform-management/Leaders-Meeting-Handout.docx
+++ b/docs/platform-management/Leaders-Meeting-Handout.docx
@@ -12,7 +12,7 @@
           <w:color w:val="1F2A37"/>
           <w:sz w:val="34"/>
         </w:rPr>
-        <w:t xml:space="preserve">Leaders meeting: child safety, roles, change process, onboarding</w:t>
+        <w:t xml:space="preserve">Leaders meeting: child safety, roles, change process, onboarding, continuity</w:t>
       </w:r>
     </w:p>
     <w:p>
@@ -24,7 +24,7 @@
           <w:color w:val="4F5B69"/>
           <w:sz w:val="22"/>
         </w:rPr>
-        <w:t xml:space="preserve">Thursday 22 October 2026 · about 90 minutes · Organizer: Kevin Hallinan</w:t>
+        <w:t xml:space="preserve">Thursday 22 October 2026 · about 105 minutes · Organizer: Kevin Hallinan</w:t>
       </w:r>
     </w:p>
     <w:p>
@@ -384,6 +384,57 @@
               <w:rPr>
                 <w:sz w:val="21"/>
               </w:rPr>
+              <w:t xml:space="preserve">15 min</w:t>
+            </w:r>
+          </w:p>
+        </w:tc>
+        <w:tc>
+          <w:tcPr>
+            <w:tcW w:w="3900" w:type="dxa"/>
+          </w:tcPr>
+          <w:p>
+            <w:pPr>
+              <w:spacing w:before="0" w:after="0"/>
+            </w:pPr>
+            <w:r>
+              <w:rPr>
+                <w:b/>
+                <w:sz w:val="21"/>
+              </w:rPr>
+              <w:t xml:space="preserve">5. Continuity plan</w:t>
+            </w:r>
+          </w:p>
+        </w:tc>
+        <w:tc>
+          <w:tcPr>
+            <w:tcW w:w="5400" w:type="dxa"/>
+          </w:tcPr>
+          <w:p>
+            <w:pPr>
+              <w:spacing w:before="0" w:after="0"/>
+            </w:pPr>
+            <w:r>
+              <w:rPr>
+                <w:sz w:val="21"/>
+              </w:rPr>
+              <w:t xml:space="preserve">Backups for every role; the Oloibiri worksheet</w:t>
+            </w:r>
+          </w:p>
+        </w:tc>
+      </w:tr>
+      <w:tr>
+        <w:tc>
+          <w:tcPr>
+            <w:tcW w:w="1100" w:type="dxa"/>
+          </w:tcPr>
+          <w:p>
+            <w:pPr>
+              <w:spacing w:before="0" w:after="0"/>
+            </w:pPr>
+            <w:r>
+              <w:rPr>
+                <w:sz w:val="21"/>
+              </w:rPr>
               <w:t xml:space="preserve">5 min</w:t>
             </w:r>
           </w:p>
@@ -569,6 +620,55 @@
           <w:sz w:val="21"/>
         </w:rPr>
         <w:t xml:space="preserve">• What must be ready before enrolling children? Who mentors a new organization in its first month?</w:t>
+      </w:r>
+    </w:p>
+    <w:p>
+      <w:pPr>
+        <w:spacing w:before="120" w:after="40"/>
+      </w:pPr>
+      <w:r>
+        <w:rPr>
+          <w:b/>
+          <w:color w:val="1F6F6B"/>
+          <w:sz w:val="24"/>
+        </w:rPr>
+        <w:t xml:space="preserve">5. Continuity plan (15 min)</w:t>
+      </w:r>
+    </w:p>
+    <w:p>
+      <w:pPr>
+        <w:spacing w:before="0" w:after="30"/>
+        <w:ind w:left="284" w:hanging="200"/>
+      </w:pPr>
+      <w:r>
+        <w:rPr>
+          <w:sz w:val="21"/>
+        </w:rPr>
+        <w:t xml:space="preserve">• The programme keeps running and children stay safe when any one person is missing. Does every critical role have a named backup?</w:t>
+      </w:r>
+    </w:p>
+    <w:p>
+      <w:pPr>
+        <w:spacing w:before="0" w:after="30"/>
+        <w:ind w:left="284" w:hanging="200"/>
+      </w:pPr>
+      <w:r>
+        <w:rPr>
+          <w:sz w:val="21"/>
+        </w:rPr>
+        <w:t xml:space="preserve">• Key people: Kevin Hallinan is CTO and leads Grants and Partnerships, and Randy Hinders will take over as CTO in time. Silas Clergy is the Platform Administrator Assistant and receives the safety and triage emails. nextVillage and vAI own the platform.</w:t>
+      </w:r>
+    </w:p>
+    <w:p>
+      <w:pPr>
+        <w:spacing w:before="0" w:after="30"/>
+        <w:ind w:left="284" w:hanging="200"/>
+      </w:pPr>
+      <w:r>
+        <w:rPr>
+          <w:sz w:val="21"/>
+        </w:rPr>
+        <w:t xml:space="preserve">• Who reaches the lab, internet account, signed forms and the platform team if the main person is away? Next: a 90-minute working session with Divinegift, Confidence and Bennywhite.</w:t>
       </w:r>
     </w:p>
     <w:p>

</xml_diff>